<commit_message>
Updated files for week 6 tutorial
</commit_message>
<xml_diff>
--- a/Documents/User Requirements Questions (DRAFT).docx
+++ b/Documents/User Requirements Questions (DRAFT).docx
@@ -17,6 +17,9 @@
       <w:r>
         <w:t>Expense Sharing App | Student Split</w:t>
       </w:r>
+      <w:r>
+        <w:t xml:space="preserve"> | Team 5E</w:t>
+      </w:r>
     </w:p>
     <w:p>
       <w:pPr>
@@ -248,11 +251,6 @@
       </w:r>
     </w:p>
     <w:p>
-      <w:r>
-        <w:t xml:space="preserve">Multer - </w:t>
-      </w:r>
-    </w:p>
-    <w:p>
       <w:pPr>
         <w:pStyle w:val="Heading3"/>
       </w:pPr>
@@ -400,20 +398,304 @@
         <w:spacing w:line="360" w:lineRule="auto"/>
       </w:pPr>
       <w:r>
+        <w:t>How do you usually get reminded about bills or your contributions?</w:t>
+      </w:r>
+    </w:p>
+    <w:p>
+      <w:pPr>
+        <w:pStyle w:val="ListParagraph"/>
+        <w:numPr>
+          <w:ilvl w:val="0"/>
+          <w:numId w:val="3"/>
+        </w:numPr>
+        <w:spacing w:line="360" w:lineRule="auto"/>
+      </w:pPr>
+      <w:r>
         <w:lastRenderedPageBreak/>
-        <w:t>How do you usually get reminded about bills or your contributions?</w:t>
-      </w:r>
-    </w:p>
-    <w:p>
-      <w:pPr>
-        <w:pStyle w:val="ListParagraph"/>
-        <w:numPr>
-          <w:ilvl w:val="0"/>
+        <w:t>Validation</w:t>
+      </w:r>
+    </w:p>
+    <w:p>
+      <w:pPr>
+        <w:pStyle w:val="ListParagraph"/>
+        <w:numPr>
+          <w:ilvl w:val="1"/>
           <w:numId w:val="3"/>
         </w:numPr>
         <w:spacing w:line="360" w:lineRule="auto"/>
       </w:pPr>
       <w:r>
+        <w:t>If there was an app that helped you split bills and shared space fairly, would you use it?</w:t>
+      </w:r>
+    </w:p>
+    <w:p>
+      <w:pPr>
+        <w:pStyle w:val="ListParagraph"/>
+        <w:numPr>
+          <w:ilvl w:val="1"/>
+          <w:numId w:val="3"/>
+        </w:numPr>
+        <w:spacing w:line="360" w:lineRule="auto"/>
+      </w:pPr>
+      <w:r>
+        <w:t>What would make you trust an app with your expense tracking?</w:t>
+      </w:r>
+    </w:p>
+    <w:p>
+      <w:pPr>
+        <w:pStyle w:val="ListParagraph"/>
+        <w:numPr>
+          <w:ilvl w:val="1"/>
+          <w:numId w:val="3"/>
+        </w:numPr>
+        <w:spacing w:line="360" w:lineRule="auto"/>
+      </w:pPr>
+      <w:r>
+        <w:t>How important is it that the app doesn’t touch your money, just helps you plan?</w:t>
+      </w:r>
+    </w:p>
+    <w:p>
+      <w:pPr>
+        <w:pStyle w:val="ListParagraph"/>
+        <w:numPr>
+          <w:ilvl w:val="1"/>
+          <w:numId w:val="3"/>
+        </w:numPr>
+        <w:spacing w:line="360" w:lineRule="auto"/>
+      </w:pPr>
+      <w:r>
+        <w:t>Would reminders or nudges to pay bills be helpful or annoying?</w:t>
+      </w:r>
+    </w:p>
+    <w:p>
+      <w:pPr>
+        <w:pStyle w:val="ListParagraph"/>
+        <w:numPr>
+          <w:ilvl w:val="1"/>
+          <w:numId w:val="3"/>
+        </w:numPr>
+        <w:spacing w:line="360" w:lineRule="auto"/>
+      </w:pPr>
+      <w:r>
+        <w:t>Would you find value in tracking other splits? (cupboards, chores etc)</w:t>
+      </w:r>
+    </w:p>
+    <w:p>
+      <w:pPr>
+        <w:pStyle w:val="ListParagraph"/>
+        <w:numPr>
+          <w:ilvl w:val="0"/>
+          <w:numId w:val="3"/>
+        </w:numPr>
+        <w:spacing w:line="360" w:lineRule="auto"/>
+      </w:pPr>
+      <w:r>
+        <w:t xml:space="preserve">Features </w:t>
+      </w:r>
+    </w:p>
+    <w:p>
+      <w:pPr>
+        <w:pStyle w:val="ListParagraph"/>
+        <w:numPr>
+          <w:ilvl w:val="1"/>
+          <w:numId w:val="3"/>
+        </w:numPr>
+        <w:spacing w:line="360" w:lineRule="auto"/>
+      </w:pPr>
+      <w:r>
+        <w:t>Which of these would you find useful: reminders, visual breakdowns (charts/graphs), share task list, space allocation?</w:t>
+      </w:r>
+    </w:p>
+    <w:p>
+      <w:pPr>
+        <w:pStyle w:val="ListParagraph"/>
+        <w:numPr>
+          <w:ilvl w:val="1"/>
+          <w:numId w:val="3"/>
+        </w:numPr>
+        <w:spacing w:line="360" w:lineRule="auto"/>
+      </w:pPr>
+      <w:r>
+        <w:t>What would make you want to use the app regularly?</w:t>
+      </w:r>
+    </w:p>
+    <w:p>
+      <w:pPr>
+        <w:pStyle w:val="ListParagraph"/>
+        <w:numPr>
+          <w:ilvl w:val="1"/>
+          <w:numId w:val="3"/>
+        </w:numPr>
+        <w:spacing w:line="360" w:lineRule="auto"/>
+      </w:pPr>
+      <w:r>
+        <w:t>Would you prefer a mobile app, web app or both?</w:t>
+      </w:r>
+    </w:p>
+    <w:p>
+      <w:pPr>
+        <w:pStyle w:val="ListParagraph"/>
+        <w:numPr>
+          <w:ilvl w:val="1"/>
+          <w:numId w:val="3"/>
+        </w:numPr>
+        <w:spacing w:line="360" w:lineRule="auto"/>
+      </w:pPr>
+      <w:r>
+        <w:t>What kind of notification would you find helpful?</w:t>
+      </w:r>
+    </w:p>
+    <w:p>
+      <w:pPr>
+        <w:rPr>
+          <w:rFonts w:eastAsiaTheme="majorEastAsia" w:cstheme="majorBidi"/>
+          <w:color w:val="0F4761" w:themeColor="accent1" w:themeShade="BF"/>
+          <w:sz w:val="28"/>
+          <w:szCs w:val="28"/>
+        </w:rPr>
+      </w:pPr>
+      <w:r>
+        <w:br w:type="page"/>
+      </w:r>
+    </w:p>
+    <w:p>
+      <w:pPr>
+        <w:pStyle w:val="Heading3"/>
+      </w:pPr>
+      <w:r>
+        <w:lastRenderedPageBreak/>
+        <w:t>Responses</w:t>
+      </w:r>
+    </w:p>
+    <w:p>
+      <w:pPr>
+        <w:pStyle w:val="ListParagraph"/>
+        <w:numPr>
+          <w:ilvl w:val="0"/>
+          <w:numId w:val="4"/>
+        </w:numPr>
+      </w:pPr>
+      <w:r>
+        <w:t>The Problem</w:t>
+      </w:r>
+    </w:p>
+    <w:p>
+      <w:pPr>
+        <w:pStyle w:val="ListParagraph"/>
+        <w:numPr>
+          <w:ilvl w:val="1"/>
+          <w:numId w:val="4"/>
+        </w:numPr>
+      </w:pPr>
+      <w:r>
+        <w:t>A</w:t>
+      </w:r>
+    </w:p>
+    <w:p>
+      <w:pPr>
+        <w:pStyle w:val="ListParagraph"/>
+        <w:numPr>
+          <w:ilvl w:val="1"/>
+          <w:numId w:val="4"/>
+        </w:numPr>
+      </w:pPr>
+      <w:r>
+        <w:t>B</w:t>
+      </w:r>
+    </w:p>
+    <w:p>
+      <w:pPr>
+        <w:pStyle w:val="ListParagraph"/>
+        <w:numPr>
+          <w:ilvl w:val="1"/>
+          <w:numId w:val="4"/>
+        </w:numPr>
+      </w:pPr>
+      <w:r>
+        <w:t>C</w:t>
+      </w:r>
+    </w:p>
+    <w:p>
+      <w:pPr>
+        <w:pStyle w:val="ListParagraph"/>
+        <w:numPr>
+          <w:ilvl w:val="1"/>
+          <w:numId w:val="4"/>
+        </w:numPr>
+      </w:pPr>
+      <w:r>
+        <w:t>D</w:t>
+      </w:r>
+    </w:p>
+    <w:p>
+      <w:pPr>
+        <w:pStyle w:val="ListParagraph"/>
+        <w:numPr>
+          <w:ilvl w:val="0"/>
+          <w:numId w:val="4"/>
+        </w:numPr>
+      </w:pPr>
+      <w:r>
+        <w:t>The Fixes</w:t>
+      </w:r>
+    </w:p>
+    <w:p>
+      <w:pPr>
+        <w:pStyle w:val="ListParagraph"/>
+        <w:numPr>
+          <w:ilvl w:val="1"/>
+          <w:numId w:val="4"/>
+        </w:numPr>
+      </w:pPr>
+      <w:r>
+        <w:t>A</w:t>
+      </w:r>
+    </w:p>
+    <w:p>
+      <w:pPr>
+        <w:pStyle w:val="ListParagraph"/>
+        <w:numPr>
+          <w:ilvl w:val="1"/>
+          <w:numId w:val="4"/>
+        </w:numPr>
+      </w:pPr>
+      <w:r>
+        <w:t>B</w:t>
+      </w:r>
+    </w:p>
+    <w:p>
+      <w:pPr>
+        <w:pStyle w:val="ListParagraph"/>
+        <w:numPr>
+          <w:ilvl w:val="1"/>
+          <w:numId w:val="4"/>
+        </w:numPr>
+      </w:pPr>
+      <w:r>
+        <w:t>C</w:t>
+      </w:r>
+    </w:p>
+    <w:p>
+      <w:pPr>
+        <w:pStyle w:val="ListParagraph"/>
+        <w:numPr>
+          <w:ilvl w:val="1"/>
+          <w:numId w:val="4"/>
+        </w:numPr>
+      </w:pPr>
+      <w:r>
+        <w:t>D</w:t>
+      </w:r>
+    </w:p>
+    <w:p>
+      <w:pPr>
+        <w:pStyle w:val="ListParagraph"/>
+        <w:numPr>
+          <w:ilvl w:val="0"/>
+          <w:numId w:val="4"/>
+        </w:numPr>
+      </w:pPr>
+      <w:r>
         <w:t>Validation</w:t>
       </w:r>
     </w:p>
@@ -422,130 +704,530 @@
         <w:pStyle w:val="ListParagraph"/>
         <w:numPr>
           <w:ilvl w:val="1"/>
-          <w:numId w:val="3"/>
-        </w:numPr>
-        <w:spacing w:line="360" w:lineRule="auto"/>
-      </w:pPr>
-      <w:r>
-        <w:t>If there was an app that helped you split bills and shared space fairly, would you use it?</w:t>
-      </w:r>
-    </w:p>
-    <w:p>
-      <w:pPr>
-        <w:pStyle w:val="ListParagraph"/>
-        <w:numPr>
-          <w:ilvl w:val="1"/>
-          <w:numId w:val="3"/>
-        </w:numPr>
-        <w:spacing w:line="360" w:lineRule="auto"/>
-      </w:pPr>
-      <w:r>
-        <w:t>What would make you trust an app with your expense tracking?</w:t>
-      </w:r>
-    </w:p>
-    <w:p>
-      <w:pPr>
-        <w:pStyle w:val="ListParagraph"/>
-        <w:numPr>
-          <w:ilvl w:val="1"/>
-          <w:numId w:val="3"/>
-        </w:numPr>
-        <w:spacing w:line="360" w:lineRule="auto"/>
-      </w:pPr>
-      <w:r>
-        <w:t>How important is it that the app doesn’t touch your money, just helps you plan?</w:t>
-      </w:r>
-    </w:p>
-    <w:p>
-      <w:pPr>
-        <w:pStyle w:val="ListParagraph"/>
-        <w:numPr>
-          <w:ilvl w:val="1"/>
-          <w:numId w:val="3"/>
-        </w:numPr>
-        <w:spacing w:line="360" w:lineRule="auto"/>
-      </w:pPr>
-      <w:r>
-        <w:t>Would reminders or nudges to pay bills be helpful or annoying?</w:t>
-      </w:r>
-    </w:p>
-    <w:p>
-      <w:pPr>
-        <w:pStyle w:val="ListParagraph"/>
-        <w:numPr>
-          <w:ilvl w:val="1"/>
-          <w:numId w:val="3"/>
-        </w:numPr>
-        <w:spacing w:line="360" w:lineRule="auto"/>
-      </w:pPr>
-      <w:r>
-        <w:t>Would you find value in tracking other splits? (cupboards, chores etc)</w:t>
-      </w:r>
-    </w:p>
-    <w:p>
-      <w:pPr>
-        <w:pStyle w:val="ListParagraph"/>
-        <w:numPr>
-          <w:ilvl w:val="0"/>
-          <w:numId w:val="3"/>
-        </w:numPr>
-        <w:spacing w:line="360" w:lineRule="auto"/>
-      </w:pPr>
-      <w:r>
-        <w:t xml:space="preserve">Features </w:t>
-      </w:r>
-    </w:p>
-    <w:p>
-      <w:pPr>
-        <w:pStyle w:val="ListParagraph"/>
-        <w:numPr>
-          <w:ilvl w:val="1"/>
-          <w:numId w:val="3"/>
-        </w:numPr>
-        <w:spacing w:line="360" w:lineRule="auto"/>
-      </w:pPr>
-      <w:r>
-        <w:t>Which of these would you find useful: reminders, visual breakdowns (charts/graphs), share task list, space allocation?</w:t>
-      </w:r>
-    </w:p>
-    <w:p>
-      <w:pPr>
-        <w:pStyle w:val="ListParagraph"/>
-        <w:numPr>
-          <w:ilvl w:val="1"/>
-          <w:numId w:val="3"/>
-        </w:numPr>
-        <w:spacing w:line="360" w:lineRule="auto"/>
-      </w:pPr>
-      <w:r>
-        <w:t>What would make you want to use the app regularly?</w:t>
-      </w:r>
-    </w:p>
-    <w:p>
-      <w:pPr>
-        <w:pStyle w:val="ListParagraph"/>
-        <w:numPr>
-          <w:ilvl w:val="1"/>
-          <w:numId w:val="3"/>
-        </w:numPr>
-        <w:spacing w:line="360" w:lineRule="auto"/>
-      </w:pPr>
-      <w:r>
-        <w:t>Would you prefer a mobile app, web app or both?</w:t>
-      </w:r>
-    </w:p>
-    <w:p>
-      <w:pPr>
-        <w:pStyle w:val="ListParagraph"/>
-        <w:numPr>
-          <w:ilvl w:val="1"/>
-          <w:numId w:val="3"/>
-        </w:numPr>
-        <w:spacing w:line="360" w:lineRule="auto"/>
-      </w:pPr>
-      <w:r>
-        <w:t>What kind of notification would you find helpful?</w:t>
-      </w:r>
+          <w:numId w:val="4"/>
+        </w:numPr>
+      </w:pPr>
+      <w:r>
+        <w:t>A</w:t>
+      </w:r>
+    </w:p>
+    <w:p>
+      <w:pPr>
+        <w:pStyle w:val="ListParagraph"/>
+        <w:numPr>
+          <w:ilvl w:val="1"/>
+          <w:numId w:val="4"/>
+        </w:numPr>
+      </w:pPr>
+      <w:r>
+        <w:t>B</w:t>
+      </w:r>
+    </w:p>
+    <w:p>
+      <w:pPr>
+        <w:pStyle w:val="ListParagraph"/>
+        <w:numPr>
+          <w:ilvl w:val="1"/>
+          <w:numId w:val="4"/>
+        </w:numPr>
+      </w:pPr>
+      <w:r>
+        <w:t>C</w:t>
+      </w:r>
+    </w:p>
+    <w:p>
+      <w:pPr>
+        <w:pStyle w:val="ListParagraph"/>
+        <w:numPr>
+          <w:ilvl w:val="1"/>
+          <w:numId w:val="4"/>
+        </w:numPr>
+      </w:pPr>
+      <w:r>
+        <w:t>D</w:t>
+      </w:r>
+    </w:p>
+    <w:p>
+      <w:pPr>
+        <w:pStyle w:val="ListParagraph"/>
+        <w:numPr>
+          <w:ilvl w:val="0"/>
+          <w:numId w:val="4"/>
+        </w:numPr>
+      </w:pPr>
+      <w:r>
+        <w:t>Features</w:t>
+      </w:r>
+    </w:p>
+    <w:p>
+      <w:pPr>
+        <w:pStyle w:val="ListParagraph"/>
+        <w:numPr>
+          <w:ilvl w:val="1"/>
+          <w:numId w:val="4"/>
+        </w:numPr>
+      </w:pPr>
+      <w:r>
+        <w:t>A</w:t>
+      </w:r>
+    </w:p>
+    <w:p>
+      <w:pPr>
+        <w:pStyle w:val="ListParagraph"/>
+        <w:numPr>
+          <w:ilvl w:val="1"/>
+          <w:numId w:val="4"/>
+        </w:numPr>
+      </w:pPr>
+      <w:r>
+        <w:t>B</w:t>
+      </w:r>
+    </w:p>
+    <w:p>
+      <w:pPr>
+        <w:pStyle w:val="ListParagraph"/>
+        <w:numPr>
+          <w:ilvl w:val="1"/>
+          <w:numId w:val="4"/>
+        </w:numPr>
+      </w:pPr>
+      <w:r>
+        <w:t>C</w:t>
+      </w:r>
+    </w:p>
+    <w:p>
+      <w:pPr>
+        <w:pStyle w:val="ListParagraph"/>
+        <w:numPr>
+          <w:ilvl w:val="1"/>
+          <w:numId w:val="4"/>
+        </w:numPr>
+      </w:pPr>
+      <w:r>
+        <w:t>D</w:t>
+      </w:r>
+    </w:p>
+    <w:p>
+      <w:pPr>
+        <w:pStyle w:val="Heading3"/>
+      </w:pPr>
+      <w:r>
+        <w:t>User Requirements</w:t>
+      </w:r>
+    </w:p>
+    <w:p>
+      <w:pPr>
+        <w:pStyle w:val="ListParagraph"/>
+        <w:numPr>
+          <w:ilvl w:val="0"/>
+          <w:numId w:val="8"/>
+        </w:numPr>
+      </w:pPr>
+      <w:r>
+        <w:rPr>
+          <w:i/>
+          <w:iCs/>
+        </w:rPr>
+        <w:t>User should be able to…</w:t>
+      </w:r>
+    </w:p>
+    <w:p>
+      <w:pPr>
+        <w:pStyle w:val="ListParagraph"/>
+        <w:numPr>
+          <w:ilvl w:val="0"/>
+          <w:numId w:val="8"/>
+        </w:numPr>
+      </w:pPr>
+      <w:r>
+        <w:t>A</w:t>
+      </w:r>
+    </w:p>
+    <w:p>
+      <w:pPr>
+        <w:pStyle w:val="ListParagraph"/>
+        <w:numPr>
+          <w:ilvl w:val="0"/>
+          <w:numId w:val="8"/>
+        </w:numPr>
+      </w:pPr>
+      <w:r>
+        <w:t>B</w:t>
+      </w:r>
+    </w:p>
+    <w:p>
+      <w:pPr>
+        <w:pStyle w:val="ListParagraph"/>
+        <w:numPr>
+          <w:ilvl w:val="0"/>
+          <w:numId w:val="8"/>
+        </w:numPr>
+      </w:pPr>
+      <w:r>
+        <w:t>C</w:t>
+      </w:r>
+    </w:p>
+    <w:p>
+      <w:pPr>
+        <w:pStyle w:val="ListParagraph"/>
+        <w:numPr>
+          <w:ilvl w:val="0"/>
+          <w:numId w:val="8"/>
+        </w:numPr>
+      </w:pPr>
+      <w:r>
+        <w:t>D</w:t>
+      </w:r>
+    </w:p>
+    <w:p>
+      <w:pPr>
+        <w:pStyle w:val="ListParagraph"/>
+        <w:numPr>
+          <w:ilvl w:val="0"/>
+          <w:numId w:val="8"/>
+        </w:numPr>
+      </w:pPr>
+      <w:r>
+        <w:t>E</w:t>
+      </w:r>
+    </w:p>
+    <w:p>
+      <w:pPr>
+        <w:pStyle w:val="ListParagraph"/>
+        <w:numPr>
+          <w:ilvl w:val="0"/>
+          <w:numId w:val="8"/>
+        </w:numPr>
+      </w:pPr>
+      <w:r>
+        <w:t>F</w:t>
+      </w:r>
+    </w:p>
+    <w:p>
+      <w:pPr>
+        <w:pStyle w:val="ListParagraph"/>
+        <w:numPr>
+          <w:ilvl w:val="0"/>
+          <w:numId w:val="8"/>
+        </w:numPr>
+      </w:pPr>
+      <w:r>
+        <w:t>G</w:t>
+      </w:r>
+    </w:p>
+    <w:p>
+      <w:pPr>
+        <w:pStyle w:val="ListParagraph"/>
+        <w:numPr>
+          <w:ilvl w:val="0"/>
+          <w:numId w:val="8"/>
+        </w:numPr>
+      </w:pPr>
+      <w:r>
+        <w:t>H</w:t>
+      </w:r>
+    </w:p>
+    <w:p>
+      <w:pPr>
+        <w:pStyle w:val="ListParagraph"/>
+        <w:numPr>
+          <w:ilvl w:val="0"/>
+          <w:numId w:val="8"/>
+        </w:numPr>
+      </w:pPr>
+      <w:r>
+        <w:t>I</w:t>
+      </w:r>
+    </w:p>
+    <w:p>
+      <w:pPr>
+        <w:pStyle w:val="ListParagraph"/>
+        <w:numPr>
+          <w:ilvl w:val="0"/>
+          <w:numId w:val="8"/>
+        </w:numPr>
+      </w:pPr>
+      <w:r>
+        <w:t>J</w:t>
+      </w:r>
+    </w:p>
+    <w:p>
+      <w:pPr>
+        <w:pStyle w:val="ListParagraph"/>
+        <w:numPr>
+          <w:ilvl w:val="0"/>
+          <w:numId w:val="8"/>
+        </w:numPr>
+      </w:pPr>
+      <w:r>
+        <w:t>K</w:t>
+      </w:r>
+    </w:p>
+    <w:p>
+      <w:pPr>
+        <w:pStyle w:val="ListParagraph"/>
+        <w:numPr>
+          <w:ilvl w:val="0"/>
+          <w:numId w:val="8"/>
+        </w:numPr>
+      </w:pPr>
+      <w:r>
+        <w:t>L</w:t>
+      </w:r>
+    </w:p>
+    <w:p>
+      <w:pPr>
+        <w:pStyle w:val="ListParagraph"/>
+        <w:numPr>
+          <w:ilvl w:val="0"/>
+          <w:numId w:val="8"/>
+        </w:numPr>
+      </w:pPr>
+      <w:r>
+        <w:t>M</w:t>
+      </w:r>
+    </w:p>
+    <w:p>
+      <w:pPr>
+        <w:pStyle w:val="ListParagraph"/>
+        <w:numPr>
+          <w:ilvl w:val="0"/>
+          <w:numId w:val="8"/>
+        </w:numPr>
+      </w:pPr>
+      <w:r>
+        <w:t>N</w:t>
+      </w:r>
+    </w:p>
+    <w:p>
+      <w:pPr>
+        <w:pStyle w:val="ListParagraph"/>
+        <w:numPr>
+          <w:ilvl w:val="0"/>
+          <w:numId w:val="8"/>
+        </w:numPr>
+      </w:pPr>
+      <w:r>
+        <w:t xml:space="preserve">O </w:t>
+      </w:r>
+    </w:p>
+    <w:p>
+      <w:pPr>
+        <w:pStyle w:val="ListParagraph"/>
+        <w:numPr>
+          <w:ilvl w:val="0"/>
+          <w:numId w:val="8"/>
+        </w:numPr>
+      </w:pPr>
+      <w:r>
+        <w:t xml:space="preserve">P </w:t>
+      </w:r>
+    </w:p>
+    <w:p>
+      <w:pPr>
+        <w:pStyle w:val="Heading3"/>
+      </w:pPr>
+      <w:r>
+        <w:lastRenderedPageBreak/>
+        <w:t>System Requirements</w:t>
+      </w:r>
+    </w:p>
+    <w:p>
+      <w:pPr>
+        <w:pStyle w:val="ListParagraph"/>
+        <w:numPr>
+          <w:ilvl w:val="0"/>
+          <w:numId w:val="8"/>
+        </w:numPr>
+      </w:pPr>
+      <w:r>
+        <w:t xml:space="preserve">A </w:t>
+      </w:r>
+    </w:p>
+    <w:p>
+      <w:pPr>
+        <w:pStyle w:val="ListParagraph"/>
+        <w:numPr>
+          <w:ilvl w:val="0"/>
+          <w:numId w:val="8"/>
+        </w:numPr>
+      </w:pPr>
+      <w:r>
+        <w:t xml:space="preserve">B </w:t>
+      </w:r>
+    </w:p>
+    <w:p>
+      <w:pPr>
+        <w:pStyle w:val="ListParagraph"/>
+        <w:numPr>
+          <w:ilvl w:val="0"/>
+          <w:numId w:val="8"/>
+        </w:numPr>
+      </w:pPr>
+      <w:r>
+        <w:t>C</w:t>
+      </w:r>
+    </w:p>
+    <w:p>
+      <w:pPr>
+        <w:pStyle w:val="ListParagraph"/>
+        <w:numPr>
+          <w:ilvl w:val="0"/>
+          <w:numId w:val="8"/>
+        </w:numPr>
+      </w:pPr>
+      <w:r>
+        <w:t xml:space="preserve">D </w:t>
+      </w:r>
+    </w:p>
+    <w:p>
+      <w:pPr>
+        <w:pStyle w:val="ListParagraph"/>
+        <w:numPr>
+          <w:ilvl w:val="0"/>
+          <w:numId w:val="8"/>
+        </w:numPr>
+      </w:pPr>
+      <w:r>
+        <w:t xml:space="preserve">E </w:t>
+      </w:r>
+    </w:p>
+    <w:p>
+      <w:pPr>
+        <w:pStyle w:val="ListParagraph"/>
+        <w:numPr>
+          <w:ilvl w:val="0"/>
+          <w:numId w:val="8"/>
+        </w:numPr>
+      </w:pPr>
+      <w:r>
+        <w:t>F</w:t>
+      </w:r>
+    </w:p>
+    <w:p>
+      <w:pPr>
+        <w:pStyle w:val="ListParagraph"/>
+        <w:numPr>
+          <w:ilvl w:val="0"/>
+          <w:numId w:val="8"/>
+        </w:numPr>
+      </w:pPr>
+      <w:r>
+        <w:t>G</w:t>
+      </w:r>
+    </w:p>
+    <w:p>
+      <w:pPr>
+        <w:pStyle w:val="ListParagraph"/>
+        <w:numPr>
+          <w:ilvl w:val="0"/>
+          <w:numId w:val="8"/>
+        </w:numPr>
+      </w:pPr>
+      <w:r>
+        <w:t>H</w:t>
+      </w:r>
+    </w:p>
+    <w:p>
+      <w:pPr>
+        <w:pStyle w:val="ListParagraph"/>
+        <w:numPr>
+          <w:ilvl w:val="0"/>
+          <w:numId w:val="8"/>
+        </w:numPr>
+      </w:pPr>
+      <w:r>
+        <w:t>I</w:t>
+      </w:r>
+    </w:p>
+    <w:p>
+      <w:pPr>
+        <w:pStyle w:val="ListParagraph"/>
+        <w:numPr>
+          <w:ilvl w:val="0"/>
+          <w:numId w:val="8"/>
+        </w:numPr>
+      </w:pPr>
+      <w:r>
+        <w:t>J</w:t>
+      </w:r>
+    </w:p>
+    <w:p>
+      <w:pPr>
+        <w:pStyle w:val="ListParagraph"/>
+        <w:numPr>
+          <w:ilvl w:val="0"/>
+          <w:numId w:val="8"/>
+        </w:numPr>
+      </w:pPr>
+      <w:r>
+        <w:t>K</w:t>
+      </w:r>
+    </w:p>
+    <w:p>
+      <w:pPr>
+        <w:pStyle w:val="ListParagraph"/>
+        <w:numPr>
+          <w:ilvl w:val="0"/>
+          <w:numId w:val="8"/>
+        </w:numPr>
+      </w:pPr>
+      <w:r>
+        <w:t>L</w:t>
+      </w:r>
+    </w:p>
+    <w:p>
+      <w:pPr>
+        <w:pStyle w:val="ListParagraph"/>
+        <w:numPr>
+          <w:ilvl w:val="0"/>
+          <w:numId w:val="8"/>
+        </w:numPr>
+      </w:pPr>
+      <w:r>
+        <w:t>M</w:t>
+      </w:r>
+    </w:p>
+    <w:p>
+      <w:pPr>
+        <w:pStyle w:val="ListParagraph"/>
+        <w:numPr>
+          <w:ilvl w:val="0"/>
+          <w:numId w:val="8"/>
+        </w:numPr>
+      </w:pPr>
+      <w:r>
+        <w:t>N</w:t>
+      </w:r>
+    </w:p>
+    <w:p>
+      <w:pPr>
+        <w:pStyle w:val="ListParagraph"/>
+        <w:numPr>
+          <w:ilvl w:val="0"/>
+          <w:numId w:val="8"/>
+        </w:numPr>
+      </w:pPr>
+      <w:r>
+        <w:t>O</w:t>
+      </w:r>
+    </w:p>
+    <w:p>
+      <w:pPr>
+        <w:pStyle w:val="ListParagraph"/>
+        <w:numPr>
+          <w:ilvl w:val="0"/>
+          <w:numId w:val="8"/>
+        </w:numPr>
+      </w:pPr>
+      <w:r>
+        <w:t>P</w:t>
+      </w:r>
+    </w:p>
+    <w:p>
+      <w:pPr>
+        <w:pStyle w:val="ListParagraph"/>
+      </w:pPr>
     </w:p>
     <w:sectPr>
       <w:pgSz w:w="11906" w:h="16838"/>
@@ -762,6 +1444,475 @@
     </w:lvl>
   </w:abstractNum>
   <w:abstractNum w:abstractNumId="2" w15:restartNumberingAfterBreak="0">
+    <w:nsid w:val="1A4614F0"/>
+    <w:multiLevelType w:val="hybridMultilevel"/>
+    <w:tmpl w:val="D9FAC39C"/>
+    <w:lvl w:ilvl="0" w:tplc="08090019">
+      <w:start w:val="1"/>
+      <w:numFmt w:val="lowerLetter"/>
+      <w:lvlText w:val="%1."/>
+      <w:lvlJc w:val="left"/>
+      <w:pPr>
+        <w:ind w:left="720" w:hanging="360"/>
+      </w:pPr>
+      <w:rPr>
+        <w:rFonts w:hint="default"/>
+      </w:rPr>
+    </w:lvl>
+    <w:lvl w:ilvl="1" w:tplc="08090019" w:tentative="1">
+      <w:start w:val="1"/>
+      <w:numFmt w:val="lowerLetter"/>
+      <w:lvlText w:val="%2."/>
+      <w:lvlJc w:val="left"/>
+      <w:pPr>
+        <w:ind w:left="1440" w:hanging="360"/>
+      </w:pPr>
+    </w:lvl>
+    <w:lvl w:ilvl="2" w:tplc="0809001B" w:tentative="1">
+      <w:start w:val="1"/>
+      <w:numFmt w:val="lowerRoman"/>
+      <w:lvlText w:val="%3."/>
+      <w:lvlJc w:val="right"/>
+      <w:pPr>
+        <w:ind w:left="2160" w:hanging="180"/>
+      </w:pPr>
+    </w:lvl>
+    <w:lvl w:ilvl="3" w:tplc="0809000F" w:tentative="1">
+      <w:start w:val="1"/>
+      <w:numFmt w:val="decimal"/>
+      <w:lvlText w:val="%4."/>
+      <w:lvlJc w:val="left"/>
+      <w:pPr>
+        <w:ind w:left="2880" w:hanging="360"/>
+      </w:pPr>
+    </w:lvl>
+    <w:lvl w:ilvl="4" w:tplc="08090019" w:tentative="1">
+      <w:start w:val="1"/>
+      <w:numFmt w:val="lowerLetter"/>
+      <w:lvlText w:val="%5."/>
+      <w:lvlJc w:val="left"/>
+      <w:pPr>
+        <w:ind w:left="3600" w:hanging="360"/>
+      </w:pPr>
+    </w:lvl>
+    <w:lvl w:ilvl="5" w:tplc="0809001B" w:tentative="1">
+      <w:start w:val="1"/>
+      <w:numFmt w:val="lowerRoman"/>
+      <w:lvlText w:val="%6."/>
+      <w:lvlJc w:val="right"/>
+      <w:pPr>
+        <w:ind w:left="4320" w:hanging="180"/>
+      </w:pPr>
+    </w:lvl>
+    <w:lvl w:ilvl="6" w:tplc="0809000F" w:tentative="1">
+      <w:start w:val="1"/>
+      <w:numFmt w:val="decimal"/>
+      <w:lvlText w:val="%7."/>
+      <w:lvlJc w:val="left"/>
+      <w:pPr>
+        <w:ind w:left="5040" w:hanging="360"/>
+      </w:pPr>
+    </w:lvl>
+    <w:lvl w:ilvl="7" w:tplc="08090019" w:tentative="1">
+      <w:start w:val="1"/>
+      <w:numFmt w:val="lowerLetter"/>
+      <w:lvlText w:val="%8."/>
+      <w:lvlJc w:val="left"/>
+      <w:pPr>
+        <w:ind w:left="5760" w:hanging="360"/>
+      </w:pPr>
+    </w:lvl>
+    <w:lvl w:ilvl="8" w:tplc="0809001B" w:tentative="1">
+      <w:start w:val="1"/>
+      <w:numFmt w:val="lowerRoman"/>
+      <w:lvlText w:val="%9."/>
+      <w:lvlJc w:val="right"/>
+      <w:pPr>
+        <w:ind w:left="6480" w:hanging="180"/>
+      </w:pPr>
+    </w:lvl>
+  </w:abstractNum>
+  <w:abstractNum w:abstractNumId="3" w15:restartNumberingAfterBreak="0">
+    <w:nsid w:val="20C433F2"/>
+    <w:multiLevelType w:val="hybridMultilevel"/>
+    <w:tmpl w:val="B09029C4"/>
+    <w:lvl w:ilvl="0" w:tplc="08090019">
+      <w:start w:val="1"/>
+      <w:numFmt w:val="lowerLetter"/>
+      <w:lvlText w:val="%1."/>
+      <w:lvlJc w:val="left"/>
+      <w:pPr>
+        <w:ind w:left="720" w:hanging="360"/>
+      </w:pPr>
+      <w:rPr>
+        <w:rFonts w:hint="default"/>
+      </w:rPr>
+    </w:lvl>
+    <w:lvl w:ilvl="1" w:tplc="08090019" w:tentative="1">
+      <w:start w:val="1"/>
+      <w:numFmt w:val="lowerLetter"/>
+      <w:lvlText w:val="%2."/>
+      <w:lvlJc w:val="left"/>
+      <w:pPr>
+        <w:ind w:left="1440" w:hanging="360"/>
+      </w:pPr>
+    </w:lvl>
+    <w:lvl w:ilvl="2" w:tplc="0809001B" w:tentative="1">
+      <w:start w:val="1"/>
+      <w:numFmt w:val="lowerRoman"/>
+      <w:lvlText w:val="%3."/>
+      <w:lvlJc w:val="right"/>
+      <w:pPr>
+        <w:ind w:left="2160" w:hanging="180"/>
+      </w:pPr>
+    </w:lvl>
+    <w:lvl w:ilvl="3" w:tplc="0809000F" w:tentative="1">
+      <w:start w:val="1"/>
+      <w:numFmt w:val="decimal"/>
+      <w:lvlText w:val="%4."/>
+      <w:lvlJc w:val="left"/>
+      <w:pPr>
+        <w:ind w:left="2880" w:hanging="360"/>
+      </w:pPr>
+    </w:lvl>
+    <w:lvl w:ilvl="4" w:tplc="08090019" w:tentative="1">
+      <w:start w:val="1"/>
+      <w:numFmt w:val="lowerLetter"/>
+      <w:lvlText w:val="%5."/>
+      <w:lvlJc w:val="left"/>
+      <w:pPr>
+        <w:ind w:left="3600" w:hanging="360"/>
+      </w:pPr>
+    </w:lvl>
+    <w:lvl w:ilvl="5" w:tplc="0809001B" w:tentative="1">
+      <w:start w:val="1"/>
+      <w:numFmt w:val="lowerRoman"/>
+      <w:lvlText w:val="%6."/>
+      <w:lvlJc w:val="right"/>
+      <w:pPr>
+        <w:ind w:left="4320" w:hanging="180"/>
+      </w:pPr>
+    </w:lvl>
+    <w:lvl w:ilvl="6" w:tplc="0809000F" w:tentative="1">
+      <w:start w:val="1"/>
+      <w:numFmt w:val="decimal"/>
+      <w:lvlText w:val="%7."/>
+      <w:lvlJc w:val="left"/>
+      <w:pPr>
+        <w:ind w:left="5040" w:hanging="360"/>
+      </w:pPr>
+    </w:lvl>
+    <w:lvl w:ilvl="7" w:tplc="08090019" w:tentative="1">
+      <w:start w:val="1"/>
+      <w:numFmt w:val="lowerLetter"/>
+      <w:lvlText w:val="%8."/>
+      <w:lvlJc w:val="left"/>
+      <w:pPr>
+        <w:ind w:left="5760" w:hanging="360"/>
+      </w:pPr>
+    </w:lvl>
+    <w:lvl w:ilvl="8" w:tplc="0809001B" w:tentative="1">
+      <w:start w:val="1"/>
+      <w:numFmt w:val="lowerRoman"/>
+      <w:lvlText w:val="%9."/>
+      <w:lvlJc w:val="right"/>
+      <w:pPr>
+        <w:ind w:left="6480" w:hanging="180"/>
+      </w:pPr>
+    </w:lvl>
+  </w:abstractNum>
+  <w:abstractNum w:abstractNumId="4" w15:restartNumberingAfterBreak="0">
+    <w:nsid w:val="4C0C3E92"/>
+    <w:multiLevelType w:val="hybridMultilevel"/>
+    <w:tmpl w:val="C94885DC"/>
+    <w:lvl w:ilvl="0" w:tplc="0809000F">
+      <w:start w:val="1"/>
+      <w:numFmt w:val="decimal"/>
+      <w:lvlText w:val="%1."/>
+      <w:lvlJc w:val="left"/>
+      <w:pPr>
+        <w:ind w:left="720" w:hanging="360"/>
+      </w:pPr>
+      <w:rPr>
+        <w:rFonts w:hint="default"/>
+      </w:rPr>
+    </w:lvl>
+    <w:lvl w:ilvl="1" w:tplc="08090019">
+      <w:start w:val="1"/>
+      <w:numFmt w:val="lowerLetter"/>
+      <w:lvlText w:val="%2."/>
+      <w:lvlJc w:val="left"/>
+      <w:pPr>
+        <w:ind w:left="1440" w:hanging="360"/>
+      </w:pPr>
+    </w:lvl>
+    <w:lvl w:ilvl="2" w:tplc="0809001B" w:tentative="1">
+      <w:start w:val="1"/>
+      <w:numFmt w:val="lowerRoman"/>
+      <w:lvlText w:val="%3."/>
+      <w:lvlJc w:val="right"/>
+      <w:pPr>
+        <w:ind w:left="2160" w:hanging="180"/>
+      </w:pPr>
+    </w:lvl>
+    <w:lvl w:ilvl="3" w:tplc="0809000F" w:tentative="1">
+      <w:start w:val="1"/>
+      <w:numFmt w:val="decimal"/>
+      <w:lvlText w:val="%4."/>
+      <w:lvlJc w:val="left"/>
+      <w:pPr>
+        <w:ind w:left="2880" w:hanging="360"/>
+      </w:pPr>
+    </w:lvl>
+    <w:lvl w:ilvl="4" w:tplc="08090019" w:tentative="1">
+      <w:start w:val="1"/>
+      <w:numFmt w:val="lowerLetter"/>
+      <w:lvlText w:val="%5."/>
+      <w:lvlJc w:val="left"/>
+      <w:pPr>
+        <w:ind w:left="3600" w:hanging="360"/>
+      </w:pPr>
+    </w:lvl>
+    <w:lvl w:ilvl="5" w:tplc="0809001B" w:tentative="1">
+      <w:start w:val="1"/>
+      <w:numFmt w:val="lowerRoman"/>
+      <w:lvlText w:val="%6."/>
+      <w:lvlJc w:val="right"/>
+      <w:pPr>
+        <w:ind w:left="4320" w:hanging="180"/>
+      </w:pPr>
+    </w:lvl>
+    <w:lvl w:ilvl="6" w:tplc="0809000F" w:tentative="1">
+      <w:start w:val="1"/>
+      <w:numFmt w:val="decimal"/>
+      <w:lvlText w:val="%7."/>
+      <w:lvlJc w:val="left"/>
+      <w:pPr>
+        <w:ind w:left="5040" w:hanging="360"/>
+      </w:pPr>
+    </w:lvl>
+    <w:lvl w:ilvl="7" w:tplc="08090019" w:tentative="1">
+      <w:start w:val="1"/>
+      <w:numFmt w:val="lowerLetter"/>
+      <w:lvlText w:val="%8."/>
+      <w:lvlJc w:val="left"/>
+      <w:pPr>
+        <w:ind w:left="5760" w:hanging="360"/>
+      </w:pPr>
+    </w:lvl>
+    <w:lvl w:ilvl="8" w:tplc="0809001B" w:tentative="1">
+      <w:start w:val="1"/>
+      <w:numFmt w:val="lowerRoman"/>
+      <w:lvlText w:val="%9."/>
+      <w:lvlJc w:val="right"/>
+      <w:pPr>
+        <w:ind w:left="6480" w:hanging="180"/>
+      </w:pPr>
+    </w:lvl>
+  </w:abstractNum>
+  <w:abstractNum w:abstractNumId="5" w15:restartNumberingAfterBreak="0">
+    <w:nsid w:val="4E991BBC"/>
+    <w:multiLevelType w:val="hybridMultilevel"/>
+    <w:tmpl w:val="8D80EFB4"/>
+    <w:lvl w:ilvl="0" w:tplc="70BAFB54">
+      <w:start w:val="1"/>
+      <w:numFmt w:val="bullet"/>
+      <w:lvlText w:val="-"/>
+      <w:lvlJc w:val="left"/>
+      <w:pPr>
+        <w:ind w:left="720" w:hanging="360"/>
+      </w:pPr>
+      <w:rPr>
+        <w:rFonts w:ascii="Aptos" w:eastAsiaTheme="minorHAnsi" w:hAnsi="Aptos" w:cstheme="minorBidi" w:hint="default"/>
+      </w:rPr>
+    </w:lvl>
+    <w:lvl w:ilvl="1" w:tplc="08090003" w:tentative="1">
+      <w:start w:val="1"/>
+      <w:numFmt w:val="bullet"/>
+      <w:lvlText w:val="o"/>
+      <w:lvlJc w:val="left"/>
+      <w:pPr>
+        <w:ind w:left="1440" w:hanging="360"/>
+      </w:pPr>
+      <w:rPr>
+        <w:rFonts w:ascii="Courier New" w:hAnsi="Courier New" w:cs="Courier New" w:hint="default"/>
+      </w:rPr>
+    </w:lvl>
+    <w:lvl w:ilvl="2" w:tplc="08090005" w:tentative="1">
+      <w:start w:val="1"/>
+      <w:numFmt w:val="bullet"/>
+      <w:lvlText w:val=""/>
+      <w:lvlJc w:val="left"/>
+      <w:pPr>
+        <w:ind w:left="2160" w:hanging="360"/>
+      </w:pPr>
+      <w:rPr>
+        <w:rFonts w:ascii="Wingdings" w:hAnsi="Wingdings" w:hint="default"/>
+      </w:rPr>
+    </w:lvl>
+    <w:lvl w:ilvl="3" w:tplc="08090001" w:tentative="1">
+      <w:start w:val="1"/>
+      <w:numFmt w:val="bullet"/>
+      <w:lvlText w:val=""/>
+      <w:lvlJc w:val="left"/>
+      <w:pPr>
+        <w:ind w:left="2880" w:hanging="360"/>
+      </w:pPr>
+      <w:rPr>
+        <w:rFonts w:ascii="Symbol" w:hAnsi="Symbol" w:hint="default"/>
+      </w:rPr>
+    </w:lvl>
+    <w:lvl w:ilvl="4" w:tplc="08090003" w:tentative="1">
+      <w:start w:val="1"/>
+      <w:numFmt w:val="bullet"/>
+      <w:lvlText w:val="o"/>
+      <w:lvlJc w:val="left"/>
+      <w:pPr>
+        <w:ind w:left="3600" w:hanging="360"/>
+      </w:pPr>
+      <w:rPr>
+        <w:rFonts w:ascii="Courier New" w:hAnsi="Courier New" w:cs="Courier New" w:hint="default"/>
+      </w:rPr>
+    </w:lvl>
+    <w:lvl w:ilvl="5" w:tplc="08090005" w:tentative="1">
+      <w:start w:val="1"/>
+      <w:numFmt w:val="bullet"/>
+      <w:lvlText w:val=""/>
+      <w:lvlJc w:val="left"/>
+      <w:pPr>
+        <w:ind w:left="4320" w:hanging="360"/>
+      </w:pPr>
+      <w:rPr>
+        <w:rFonts w:ascii="Wingdings" w:hAnsi="Wingdings" w:hint="default"/>
+      </w:rPr>
+    </w:lvl>
+    <w:lvl w:ilvl="6" w:tplc="08090001" w:tentative="1">
+      <w:start w:val="1"/>
+      <w:numFmt w:val="bullet"/>
+      <w:lvlText w:val=""/>
+      <w:lvlJc w:val="left"/>
+      <w:pPr>
+        <w:ind w:left="5040" w:hanging="360"/>
+      </w:pPr>
+      <w:rPr>
+        <w:rFonts w:ascii="Symbol" w:hAnsi="Symbol" w:hint="default"/>
+      </w:rPr>
+    </w:lvl>
+    <w:lvl w:ilvl="7" w:tplc="08090003" w:tentative="1">
+      <w:start w:val="1"/>
+      <w:numFmt w:val="bullet"/>
+      <w:lvlText w:val="o"/>
+      <w:lvlJc w:val="left"/>
+      <w:pPr>
+        <w:ind w:left="5760" w:hanging="360"/>
+      </w:pPr>
+      <w:rPr>
+        <w:rFonts w:ascii="Courier New" w:hAnsi="Courier New" w:cs="Courier New" w:hint="default"/>
+      </w:rPr>
+    </w:lvl>
+    <w:lvl w:ilvl="8" w:tplc="08090005" w:tentative="1">
+      <w:start w:val="1"/>
+      <w:numFmt w:val="bullet"/>
+      <w:lvlText w:val=""/>
+      <w:lvlJc w:val="left"/>
+      <w:pPr>
+        <w:ind w:left="6480" w:hanging="360"/>
+      </w:pPr>
+      <w:rPr>
+        <w:rFonts w:ascii="Wingdings" w:hAnsi="Wingdings" w:hint="default"/>
+      </w:rPr>
+    </w:lvl>
+  </w:abstractNum>
+  <w:abstractNum w:abstractNumId="6" w15:restartNumberingAfterBreak="0">
+    <w:nsid w:val="50510991"/>
+    <w:multiLevelType w:val="hybridMultilevel"/>
+    <w:tmpl w:val="9670AD1A"/>
+    <w:lvl w:ilvl="0" w:tplc="0809000F">
+      <w:start w:val="1"/>
+      <w:numFmt w:val="decimal"/>
+      <w:lvlText w:val="%1."/>
+      <w:lvlJc w:val="left"/>
+      <w:pPr>
+        <w:ind w:left="720" w:hanging="360"/>
+      </w:pPr>
+      <w:rPr>
+        <w:rFonts w:hint="default"/>
+      </w:rPr>
+    </w:lvl>
+    <w:lvl w:ilvl="1" w:tplc="08090019" w:tentative="1">
+      <w:start w:val="1"/>
+      <w:numFmt w:val="lowerLetter"/>
+      <w:lvlText w:val="%2."/>
+      <w:lvlJc w:val="left"/>
+      <w:pPr>
+        <w:ind w:left="1440" w:hanging="360"/>
+      </w:pPr>
+    </w:lvl>
+    <w:lvl w:ilvl="2" w:tplc="0809001B" w:tentative="1">
+      <w:start w:val="1"/>
+      <w:numFmt w:val="lowerRoman"/>
+      <w:lvlText w:val="%3."/>
+      <w:lvlJc w:val="right"/>
+      <w:pPr>
+        <w:ind w:left="2160" w:hanging="180"/>
+      </w:pPr>
+    </w:lvl>
+    <w:lvl w:ilvl="3" w:tplc="0809000F" w:tentative="1">
+      <w:start w:val="1"/>
+      <w:numFmt w:val="decimal"/>
+      <w:lvlText w:val="%4."/>
+      <w:lvlJc w:val="left"/>
+      <w:pPr>
+        <w:ind w:left="2880" w:hanging="360"/>
+      </w:pPr>
+    </w:lvl>
+    <w:lvl w:ilvl="4" w:tplc="08090019" w:tentative="1">
+      <w:start w:val="1"/>
+      <w:numFmt w:val="lowerLetter"/>
+      <w:lvlText w:val="%5."/>
+      <w:lvlJc w:val="left"/>
+      <w:pPr>
+        <w:ind w:left="3600" w:hanging="360"/>
+      </w:pPr>
+    </w:lvl>
+    <w:lvl w:ilvl="5" w:tplc="0809001B" w:tentative="1">
+      <w:start w:val="1"/>
+      <w:numFmt w:val="lowerRoman"/>
+      <w:lvlText w:val="%6."/>
+      <w:lvlJc w:val="right"/>
+      <w:pPr>
+        <w:ind w:left="4320" w:hanging="180"/>
+      </w:pPr>
+    </w:lvl>
+    <w:lvl w:ilvl="6" w:tplc="0809000F" w:tentative="1">
+      <w:start w:val="1"/>
+      <w:numFmt w:val="decimal"/>
+      <w:lvlText w:val="%7."/>
+      <w:lvlJc w:val="left"/>
+      <w:pPr>
+        <w:ind w:left="5040" w:hanging="360"/>
+      </w:pPr>
+    </w:lvl>
+    <w:lvl w:ilvl="7" w:tplc="08090019" w:tentative="1">
+      <w:start w:val="1"/>
+      <w:numFmt w:val="lowerLetter"/>
+      <w:lvlText w:val="%8."/>
+      <w:lvlJc w:val="left"/>
+      <w:pPr>
+        <w:ind w:left="5760" w:hanging="360"/>
+      </w:pPr>
+    </w:lvl>
+    <w:lvl w:ilvl="8" w:tplc="0809001B" w:tentative="1">
+      <w:start w:val="1"/>
+      <w:numFmt w:val="lowerRoman"/>
+      <w:lvlText w:val="%9."/>
+      <w:lvlJc w:val="right"/>
+      <w:pPr>
+        <w:ind w:left="6480" w:hanging="180"/>
+      </w:pPr>
+    </w:lvl>
+  </w:abstractNum>
+  <w:abstractNum w:abstractNumId="7" w15:restartNumberingAfterBreak="0">
     <w:nsid w:val="52EE4E45"/>
     <w:multiLevelType w:val="hybridMultilevel"/>
     <w:tmpl w:val="3A86A538"/>
@@ -851,13 +2002,28 @@
     </w:lvl>
   </w:abstractNum>
   <w:num w:numId="1" w16cid:durableId="1619484965">
-    <w:abstractNumId w:val="2"/>
+    <w:abstractNumId w:val="7"/>
   </w:num>
   <w:num w:numId="2" w16cid:durableId="964576956">
     <w:abstractNumId w:val="1"/>
   </w:num>
   <w:num w:numId="3" w16cid:durableId="1176573663">
     <w:abstractNumId w:val="0"/>
+  </w:num>
+  <w:num w:numId="4" w16cid:durableId="1833987098">
+    <w:abstractNumId w:val="4"/>
+  </w:num>
+  <w:num w:numId="5" w16cid:durableId="1273853387">
+    <w:abstractNumId w:val="6"/>
+  </w:num>
+  <w:num w:numId="6" w16cid:durableId="1497501729">
+    <w:abstractNumId w:val="2"/>
+  </w:num>
+  <w:num w:numId="7" w16cid:durableId="1289509212">
+    <w:abstractNumId w:val="3"/>
+  </w:num>
+  <w:num w:numId="8" w16cid:durableId="1795899894">
+    <w:abstractNumId w:val="5"/>
   </w:num>
 </w:numbering>
 </file>

</xml_diff>